<commit_message>
Handover docs: Node QC calls send scope=qc for Assistant Team Leaders; troubleshooting row
Co-authored-by: Cursor <cursoragent@cursor.com>
</commit_message>
<xml_diff>
--- a/docs/handover/HRMS Developer Guide/02 - Setup and Deployment.docx
+++ b/docs/handover/HRMS Developer Guide/02 - Setup and Deployment.docx
@@ -2757,6 +2757,28 @@
           </w:p>
         </w:tc>
       </w:tr>
+      <w:tr>
+        <w:tc>
+          <w:tcPr>
+            <w:tcW w:type="dxa" w:w="4968"/>
+          </w:tcPr>
+          <w:p>
+            <w:r>
+              <w:t>Assistant Team Leader gets 404 'Tracker or file not found' on QC Form</w:t>
+            </w:r>
+          </w:p>
+        </w:tc>
+        <w:tc>
+          <w:tcPr>
+            <w:tcW w:type="dxa" w:w="4968"/>
+          </w:tcPr>
+          <w:p>
+            <w:r>
+              <w:t>The ATL must be the agent's Quality Analyst (qa_id); check the role is Assistant Team Leader, not QA. Node must be built with the scope = 'qc' change (npm run build, pm2 restart node-backend).</w:t>
+            </w:r>
+          </w:p>
+        </w:tc>
+      </w:tr>
     </w:tbl>
     <w:p/>
     <w:p>

</xml_diff>

<commit_message>
Handover docs: remove mentions of the handover build scripts
Co-authored-by: Cursor <cursoragent@cursor.com>
</commit_message>
<xml_diff>
--- a/docs/handover/HRMS Developer Guide/02 - Setup and Deployment.docx
+++ b/docs/handover/HRMS Developer Guide/02 - Setup and Deployment.docx
@@ -1008,38 +1008,6 @@
           <w:p>
             <w:r>
               <w:t>capture_screenshots.py (Playwright, local only) then build_sop_docs.py.</w:t>
-            </w:r>
-          </w:p>
-        </w:tc>
-      </w:tr>
-      <w:tr>
-        <w:tc>
-          <w:tcPr>
-            <w:tcW w:type="dxa" w:w="3312"/>
-          </w:tcPr>
-          <w:p>
-            <w:r>
-              <w:t>Handover documents</w:t>
-            </w:r>
-          </w:p>
-        </w:tc>
-        <w:tc>
-          <w:tcPr>
-            <w:tcW w:type="dxa" w:w="3312"/>
-          </w:tcPr>
-          <w:p>
-            <w:r>
-              <w:t>docs/handover</w:t>
-            </w:r>
-          </w:p>
-        </w:tc>
-        <w:tc>
-          <w:tcPr>
-            <w:tcW w:type="dxa" w:w="3312"/>
-          </w:tcPr>
-          <w:p>
-            <w:r>
-              <w:t>build_handover_docs.py rebuilds these files.</w:t>
             </w:r>
           </w:p>
         </w:tc>

</xml_diff>

<commit_message>
Handover docs: remove all mentions of the documentation build scripts
Co-authored-by: Cursor <cursoragent@cursor.com>
</commit_message>
<xml_diff>
--- a/docs/handover/HRMS Developer Guide/02 - Setup and Deployment.docx
+++ b/docs/handover/HRMS Developer Guide/02 - Setup and Deployment.docx
@@ -987,38 +987,6 @@
           </w:tcPr>
           <w:p>
             <w:r>
-              <w:t>SOP screenshots and Word SOPs</w:t>
-            </w:r>
-          </w:p>
-        </w:tc>
-        <w:tc>
-          <w:tcPr>
-            <w:tcW w:type="dxa" w:w="3312"/>
-          </w:tcPr>
-          <w:p>
-            <w:r>
-              <w:t>docs/sop</w:t>
-            </w:r>
-          </w:p>
-        </w:tc>
-        <w:tc>
-          <w:tcPr>
-            <w:tcW w:type="dxa" w:w="3312"/>
-          </w:tcPr>
-          <w:p>
-            <w:r>
-              <w:t>capture_screenshots.py (Playwright, local only) then build_sop_docs.py.</w:t>
-            </w:r>
-          </w:p>
-        </w:tc>
-      </w:tr>
-      <w:tr>
-        <w:tc>
-          <w:tcPr>
-            <w:tcW w:type="dxa" w:w="3312"/>
-          </w:tcPr>
-          <w:p>
-            <w:r>
               <w:t>QC tracker reset script</w:t>
             </w:r>
           </w:p>
@@ -1040,30 +1008,6 @@
           <w:p>
             <w:r>
               <w:t>See 04, section 1.1.</w:t>
-            </w:r>
-          </w:p>
-        </w:tc>
-      </w:tr>
-    </w:tbl>
-    <w:p/>
-    <w:tbl>
-      <w:tblPr>
-        <w:tblStyle w:val="TableGrid"/>
-        <w:tblW w:type="auto" w:w="0"/>
-        <w:tblLook w:firstColumn="1" w:firstRow="1" w:lastColumn="0" w:lastRow="0" w:noHBand="0" w:noVBand="1" w:val="04A0"/>
-      </w:tblPr>
-      <w:tblGrid>
-        <w:gridCol w:w="9936"/>
-      </w:tblGrid>
-      <w:tr>
-        <w:tc>
-          <w:tcPr>
-            <w:tcW w:type="dxa" w:w="9936"/>
-            <w:shd w:val="clear" w:color="auto" w:fill="FEF3C7"/>
-          </w:tcPr>
-          <w:p>
-            <w:r>
-              <w:t>docs/sop/capture_screenshots.py contains test logins. Keep it local; do not commit or share it as it is.</w:t>
             </w:r>
           </w:p>
         </w:tc>

</xml_diff>